<commit_message>
feat: add site registration settings
</commit_message>
<xml_diff>
--- a/docs/lytics_R1_scope.docx
+++ b/docs/lytics_R1_scope.docx
@@ -310,20 +310,6 @@
       </w:r>
       <w:r>
         <w:t>Export data that reflects the currently selected site, dates, and applicable view.</w:t>
-      </w:r>
-    </w:p>
-    <w:p>
-      <w:pPr>
-        <w:ind w:left="259" w:hanging="259"/>
-      </w:pPr>
-      <w:r>
-        <w:rPr>
-          <w:b/>
-        </w:rPr>
-        <w:t xml:space="preserve">• Single-user authentication: </w:t>
-      </w:r>
-      <w:r>
-        <w:t>Protect the application with a built-in single-user password login configured through environment variables.</w:t>
       </w:r>
     </w:p>
     <w:p>

</xml_diff>